<commit_message>
rewrite abstracts as single flowing paragraphs
</commit_message>
<xml_diff>
--- a/FINAL_SUBMISSION_MANUSCRIPT.docx
+++ b/FINAL_SUBMISSION_MANUSCRIPT.docx
@@ -73,135 +73,140 @@
         <w:pStyle w:val="Abstract"/>
       </w:pPr>
       <w:r>
+        <w:t xml:space="preserve">When institutions deploy AI at scale, compliance logs and audit trails accumulate at rates proportional to decision volume—but the humans who review them don’t scale the same way. This paper formalizes that gap as</w:t>
+      </w:r>
+      <w:r>
+        <w:t xml:space="preserve"> </w:t>
+      </w:r>
+      <w:r>
         <w:rPr>
-          <w:b/>
-          <w:bCs/>
+          <w:i/>
+          <w:iCs/>
         </w:rPr>
-        <w:t xml:space="preserve">Background:</w:t>
-      </w:r>
-      <w:r>
-        <w:t xml:space="preserve"> </w:t>
-      </w:r>
-      <w:r>
-        <w:t xml:space="preserve">Institutions deploying artificial intelligence (AI) at scale accumulate governance artifacts—decision logs, compliance dashboards, and audit trails—at rates proportional to decision volume. Human interpretive capacity does not scale proportionally, creating a structural tension between automated throughput and meaningful oversight.</w:t>
-      </w:r>
-    </w:p>
-    <w:p>
-      <w:pPr>
-        <w:pStyle w:val="Abstract"/>
-      </w:pPr>
-      <w:r>
-        <w:rPr>
-          <w:b/>
-          <w:bCs/>
-        </w:rPr>
-        <w:t xml:space="preserve">Methods:</w:t>
-      </w:r>
-      <w:r>
-        <w:t xml:space="preserve"> </w:t>
-      </w:r>
-      <w:r>
-        <w:t xml:space="preserve">This paper develops a continuous state-space model of institutional oversight dynamics, capturing non-linear review-depth degradation above a critical utilization threshold</w:t>
-      </w:r>
-      <w:r>
-        <w:t xml:space="preserve"> </w:t>
-      </w:r>
-      <m:oMath>
-        <m:sSub>
+        <w:t xml:space="preserve">oversight saturation</w:t>
+      </w:r>
+      <w:r>
+        <w:t xml:space="preserve">: a structural failure mode where human review capacity, bounded by cognitive constraints at</w:t>
+      </w:r>
+      <w:r>
+        <w:t xml:space="preserve"> </w:t>
+      </w:r>
+      <m:oMath>
+        <m:r>
+          <m:t>O</m:t>
+        </m:r>
+        <m:r>
+          <m:rPr>
+            <m:sty m:val="p"/>
+          </m:rPr>
+          <m:t>(</m:t>
+        </m:r>
+        <m:r>
+          <m:rPr>
+            <m:sty m:val="p"/>
+          </m:rPr>
+          <m:t>log</m:t>
+        </m:r>
+        <m:r>
+          <m:t>N</m:t>
+        </m:r>
+        <m:r>
+          <m:rPr>
+            <m:sty m:val="p"/>
+          </m:rPr>
+          <m:t>)</m:t>
+        </m:r>
+      </m:oMath>
+      <w:r>
+        <w:t xml:space="preserve">, falls progressively behind artifact generation at</w:t>
+      </w:r>
+      <w:r>
+        <w:t xml:space="preserve"> </w:t>
+      </w:r>
+      <m:oMath>
+        <m:r>
+          <m:t>O</m:t>
+        </m:r>
+        <m:r>
+          <m:rPr>
+            <m:sty m:val="p"/>
+          </m:rPr>
+          <m:t>(</m:t>
+        </m:r>
+        <m:r>
+          <m:t>N</m:t>
+        </m:r>
+        <m:r>
+          <m:rPr>
+            <m:sty m:val="p"/>
+          </m:rPr>
+          <m:t>)</m:t>
+        </m:r>
+      </m:oMath>
+      <w:r>
+        <w:t xml:space="preserve">. I develop a continuous state-space model with a review-depth degradation function grounded in cognitive load and queueing theory, and I analyze it through Kingman’s</w:t>
+      </w:r>
+      <w:r>
+        <w:t xml:space="preserve"> </w:t>
+      </w:r>
+      <m:oMath>
+        <m:r>
+          <m:t>G</m:t>
+        </m:r>
+        <m:r>
+          <m:rPr>
+            <m:sty m:val="p"/>
+          </m:rPr>
+          <m:t>/</m:t>
+        </m:r>
+        <m:r>
+          <m:t>G</m:t>
+        </m:r>
+        <m:r>
+          <m:rPr>
+            <m:sty m:val="p"/>
+          </m:rPr>
+          <m:t>/</m:t>
+        </m:r>
+        <m:r>
+          <m:t>1</m:t>
+        </m:r>
+      </m:oMath>
+      <w:r>
+        <w:t xml:space="preserve"> </w:t>
+      </w:r>
+      <w:r>
+        <w:t xml:space="preserve">heavy-traffic approximation alongside Monte Carlo simulation (</w:t>
+      </w:r>
+      <m:oMath>
+        <m:r>
+          <m:t>N</m:t>
+        </m:r>
+        <m:r>
+          <m:rPr>
+            <m:sty m:val="p"/>
+          </m:rPr>
+          <m:t>=</m:t>
+        </m:r>
+        <m:r>
+          <m:t>120</m:t>
+        </m:r>
+      </m:oMath>
+      <w:r>
+        <w:t xml:space="preserve"> </w:t>
+      </w:r>
+      <w:r>
+        <w:t xml:space="preserve">runs). The results show that human-in-the-loop oversight pipelines saturate 2.71 times faster than memoryless audit models predict, driven by heavy-tailed log-normal service time distributions (</w:t>
+      </w:r>
+      <m:oMath>
+        <m:sSubSup>
           <m:e>
             <m:r>
-              <m:t>ρ</m:t>
+              <m:t>C</m:t>
             </m:r>
           </m:e>
           <m:sub>
             <m:r>
-              <m:t>c</m:t>
-            </m:r>
-          </m:sub>
-        </m:sSub>
-      </m:oMath>
-      <w:r>
-        <w:t xml:space="preserve">. The model is analyzed through Kingman’s</w:t>
-      </w:r>
-      <w:r>
-        <w:t xml:space="preserve"> </w:t>
-      </w:r>
-      <m:oMath>
-        <m:r>
-          <m:t>G</m:t>
-        </m:r>
-        <m:r>
-          <m:rPr>
-            <m:sty m:val="p"/>
-          </m:rPr>
-          <m:t>/</m:t>
-        </m:r>
-        <m:r>
-          <m:t>G</m:t>
-        </m:r>
-        <m:r>
-          <m:rPr>
-            <m:sty m:val="p"/>
-          </m:rPr>
-          <m:t>/</m:t>
-        </m:r>
-        <m:r>
-          <m:t>1</m:t>
-        </m:r>
-      </m:oMath>
-      <w:r>
-        <w:t xml:space="preserve"> </w:t>
-      </w:r>
-      <w:r>
-        <w:t xml:space="preserve">heavy-traffic approximation and validated via Monte Carlo simulation (</w:t>
-      </w:r>
-      <m:oMath>
-        <m:r>
-          <m:t>N</m:t>
-        </m:r>
-        <m:r>
-          <m:rPr>
-            <m:sty m:val="p"/>
-          </m:rPr>
-          <m:t>=</m:t>
-        </m:r>
-        <m:r>
-          <m:t>120</m:t>
-        </m:r>
-      </m:oMath>
-      <w:r>
-        <w:t xml:space="preserve"> </w:t>
-      </w:r>
-      <w:r>
-        <w:t xml:space="preserve">runs, 95% confidence intervals). Three compounding mechanisms are identified and formalized: assurance surface inflation, accountability routing fragmentation, and review-depth asymmetry. A State-Estimation Degradation Index (SEDI) is derived, operationalizing governance observability as a load-dependent deployment variable computable from three public record streams.</w:t>
-      </w:r>
-    </w:p>
-    <w:p>
-      <w:pPr>
-        <w:pStyle w:val="Abstract"/>
-      </w:pPr>
-      <w:r>
-        <w:rPr>
-          <w:b/>
-          <w:bCs/>
-        </w:rPr>
-        <w:t xml:space="preserve">Results:</w:t>
-      </w:r>
-      <w:r>
-        <w:t xml:space="preserve"> </w:t>
-      </w:r>
-      <w:r>
-        <w:t xml:space="preserve">Human-in-the-loop oversight pipelines saturate 2.71 times faster than memoryless audit models predict, driven by heavy-tailed log-normal service time distributions (</w:t>
-      </w:r>
-      <m:oMath>
-        <m:sSubSup>
-          <m:e>
-            <m:r>
-              <m:t>C</m:t>
-            </m:r>
-          </m:e>
-          <m:sub>
-            <m:r>
               <m:t>s</m:t>
             </m:r>
           </m:sub>
@@ -222,7 +227,7 @@
         </m:r>
       </m:oMath>
       <w:r>
-        <w:t xml:space="preserve">). SEDI crosses the 0.50 observability threshold between</w:t>
+        <w:t xml:space="preserve">). I introduce the State-Estimation Degradation Index (SEDI), a governance observability metric computable from three public record streams—artifact write rates, resolution latency, and administrative appeal rates—requiring no proprietary system access. SEDI crosses the 0.50 observability threshold between</w:t>
       </w:r>
       <w:r>
         <w:t xml:space="preserve"> </w:t>
@@ -262,7 +267,7 @@
         <w:t xml:space="preserve"> </w:t>
       </w:r>
       <w:r>
-        <w:t xml:space="preserve">pilot deployment scale. At</w:t>
+        <w:t xml:space="preserve">pilot deployment scale, and at</w:t>
       </w:r>
       <w:r>
         <w:t xml:space="preserve"> </w:t>
@@ -282,25 +287,7 @@
         <w:t xml:space="preserve"> </w:t>
       </w:r>
       <w:r>
-        <w:t xml:space="preserve">baseline, artifact-based auditing provides less than half the oversight signal required to characterize operational review depth. Both the queue-length acceleration and depth collapse are invisible to artifact-count compliance dashboards.</w:t>
-      </w:r>
-    </w:p>
-    <w:p>
-      <w:pPr>
-        <w:pStyle w:val="Abstract"/>
-      </w:pPr>
-      <w:r>
-        <w:rPr>
-          <w:b/>
-          <w:bCs/>
-        </w:rPr>
-        <w:t xml:space="preserve">Conclusions:</w:t>
-      </w:r>
-      <w:r>
-        <w:t xml:space="preserve"> </w:t>
-      </w:r>
-      <w:r>
-        <w:t xml:space="preserve">Standard artifact-count compliance frameworks are structurally incapable of detecting oversight saturation onset. Governance observability is not a static property but a load-dependent state variable that degrades non-linearly with deployment scale. Three governance-by-design principles are derived: treating oversight capacity as a first-class scaling constraint, deploying SEDI as an active runtime observability metric with automated backpressure mechanisms, and separating answerability from enforcement authority in governance architecture design.</w:t>
+        <w:t xml:space="preserve">baseline, artifact-based auditing provides less than half the oversight signal needed to characterize operational review depth. Three compounding mechanisms—assurance surface inflation, accountability routing fragmentation, and review-depth asymmetry—produce systematic oversight failure that artifact-count compliance dashboards cannot detect. I derive three governance-by-design principles from these findings: treating oversight capacity as a first-class scaling constraint, deploying SEDI as an active runtime observability metric with automated backpressure, and separating answerability from enforcement authority in governance architecture design.</w:t>
       </w:r>
     </w:p>
     <w:p>

</xml_diff>

<commit_message>
apply ai_tells.md: remove 'dynamic', reduce 'framework' overuse, fix em dashes
</commit_message>
<xml_diff>
--- a/FINAL_SUBMISSION_MANUSCRIPT.docx
+++ b/FINAL_SUBMISSION_MANUSCRIPT.docx
@@ -330,7 +330,7 @@
         <w:pStyle w:val="BodyText"/>
       </w:pPr>
       <w:r>
-        <w:t xml:space="preserve">But there is a critical division here that most compliance frameworks miss.</w:t>
+        <w:t xml:space="preserve">But there is a critical division here that most compliance systems miss.</w:t>
       </w:r>
       <w:r>
         <w:t xml:space="preserve"> </w:t>
@@ -514,7 +514,7 @@
         <w:pStyle w:val="BodyText"/>
       </w:pPr>
       <w:r>
-        <w:t xml:space="preserve">I make four contributions in this paper. First, I develop a continuous state-space model of saturation dynamics, with a review-depth degradation function grounded in cognitive load and queueing theory. Kingman’s</w:t>
+        <w:t xml:space="preserve">I make four contributions in this paper. First, I develop a continuous state-space model of saturation behavior, with a review-depth degradation function grounded in cognitive load and queueing theory. Kingman’s</w:t>
       </w:r>
       <w:r>
         <w:t xml:space="preserve"> </w:t>
@@ -2586,7 +2586,7 @@
         </m:r>
       </m:oMath>
       <w:r>
-        <w:t xml:space="preserve">) audit models predict. This quantifies the structural inadequacy of compliance frameworks calibrated to Poisson or exponential processing assumptions: they systematically underestimate saturation onset.</w:t>
+        <w:t xml:space="preserve">) audit models predict. This quantifies the structural inadequacy of compliance regimes calibrated to Poisson or exponential processing assumptions: they systematically underestimate saturation onset.</w:t>
       </w:r>
     </w:p>
     <w:bookmarkEnd w:id="18"/>
@@ -4112,7 +4112,7 @@
         <w:pStyle w:val="BodyText"/>
       </w:pPr>
       <w:r>
-        <w:t xml:space="preserve">This dynamic is directly exacerbated when upstream runtime policy gateways are deployed at scale. The iCRAFT ingress-constraint architecture</w:t>
+        <w:t xml:space="preserve">This pattern is directly exacerbated when upstream runtime policy gateways are deployed at scale. The iCRAFT ingress-constraint architecture</w:t>
       </w:r>
       <w:r>
         <w:t xml:space="preserve"> </w:t>
@@ -5240,7 +5240,7 @@
         <w:pStyle w:val="FirstParagraph"/>
       </w:pPr>
       <w:r>
-        <w:t xml:space="preserve">Standard compliance frameworks require an external evaluator to infer institutional review depth from observable artifacts. Under saturation, the estimation error for</w:t>
+        <w:t xml:space="preserve">Standard compliance regimes require an external evaluator to infer institutional review depth from observable artifacts. Under saturation, the estimation error for</w:t>
       </w:r>
       <w:r>
         <w:t xml:space="preserve"> </w:t>
@@ -6803,7 +6803,7 @@
         <w:t xml:space="preserve"> </w:t>
       </w:r>
       <w:r>
-        <w:t xml:space="preserve">is not resolved by governance frameworks that specify which artifacts to generate without specifying the review bandwidth required to process them. Governance-by-design requires demonstrable human review capacity as a condition of scaling authorization. Concretely, a deployment increasing transaction volume by</w:t>
+        <w:t xml:space="preserve">is not resolved by governance approaches that specify which artifacts to generate without specifying the review bandwidth required to process them. Governance-by-design requires demonstrable human review capacity as a condition of scaling authorization. Concretely, a deployment increasing transaction volume by</w:t>
       </w:r>
       <w:r>
         <w:t xml:space="preserve"> </w:t>
@@ -7260,7 +7260,7 @@
         <w:pStyle w:val="BodyText"/>
       </w:pPr>
       <w:r>
-        <w:t xml:space="preserve">The saturation model and SEDI index give that dynamic a precise, computable form. If governance frameworks are going to target AI deployment at scale, they need to treat oversight capacity as something you measure, under load, continuously—not as a structural assumption attested by the volume of documents produced. The saturation threshold does not wait for the next compliance cycle.</w:t>
+        <w:t xml:space="preserve">The saturation model and SEDI index give that behavior a precise, computable form. If governance systems are going to target AI deployment at scale, they need to treat oversight capacity as something you measure, under load, continuously. Not as a structural assumption attested by the volume of documents produced. The saturation threshold does not wait for the next compliance cycle.</w:t>
       </w:r>
     </w:p>
     <w:bookmarkEnd w:id="56"/>

</xml_diff>